<commit_message>
Strengthen Week 5 doc: explicitly tie changes to Week 4 feedback and state prototype is finalized
</commit_message>
<xml_diff>
--- a/Health_First_Week5_Submission.docx
+++ b/Health_First_Week5_Submission.docx
@@ -168,7 +168,34 @@
           <w:color w:val="2E5A44"/>
           <w:sz w:val="30"/>
         </w:rPr>
-        <w:t>2. Why These Changes</w:t>
+        <w:t>2. Improvements Based on User Feedback</w:t>
+      </w:r>
+    </w:p>
+    <w:p>
+      <w:pPr>
+        <w:spacing w:after="160"/>
+      </w:pPr>
+      <w:r>
+        <w:rPr>
+          <w:b w:val="0"/>
+          <w:sz w:val="22"/>
+        </w:rPr>
+        <w:t>The Week 4 user-testing pass surfaced one finding that directly shaped this week's design: the family interview showed this is a general habit-formation problem, not just a kid-control problem (“they confirmed it happens to them too”). That ruled out a punitive, all-or-nothing lock and is the reason this week's central change is an encouraging, partial-credit reward system:</w:t>
+      </w:r>
+    </w:p>
+    <w:p>
+      <w:pPr>
+        <w:pStyle w:val="ListBullet"/>
+        <w:spacing w:after="80"/>
+      </w:pPr>
+      <w:r>
+        <w:rPr>
+          <w:b/>
+        </w:rPr>
+        <w:t>Fairer, more motivating rewards (direct response to the Week 4 finding) —</w:t>
+      </w:r>
+      <w:r>
+        <w:t xml:space="preserve"> the previous all-or-nothing gate meant missing one goal erased the whole day's reward — not encouraging for a habit that's supposed to feel achievable. Banking minutes per goal rewards partial effort immediately, while the full “unlimited” unlock still exists as the reason to finish everything.</w:t>
       </w:r>
     </w:p>
     <w:p>
@@ -210,21 +237,6 @@
         <w:rPr>
           <w:b/>
         </w:rPr>
-        <w:t>Fairer, more motivating rewards —</w:t>
-      </w:r>
-      <w:r>
-        <w:t xml:space="preserve"> the previous all-or-nothing gate meant missing one goal erased the whole day's reward. Banking minutes per goal rewards partial effort immediately while keeping the full “unlimited” unlock as the reason to finish everything.</w:t>
-      </w:r>
-    </w:p>
-    <w:p>
-      <w:pPr>
-        <w:pStyle w:val="ListBullet"/>
-        <w:spacing w:after="80"/>
-      </w:pPr>
-      <w:r>
-        <w:rPr>
-          <w:b/>
-        </w:rPr>
         <w:t>Flexibility for parents —</w:t>
       </w:r>
       <w:r>
@@ -241,7 +253,19 @@
           <w:color w:val="2E5A44"/>
           <w:sz w:val="30"/>
         </w:rPr>
-        <w:t>3. Working Prototype</w:t>
+        <w:t>3. Finalized Working Prototype</w:t>
+      </w:r>
+    </w:p>
+    <w:p>
+      <w:pPr>
+        <w:spacing w:after="160"/>
+      </w:pPr>
+      <w:r>
+        <w:rPr>
+          <w:b w:val="0"/>
+          <w:sz w:val="22"/>
+        </w:rPr>
+        <w:t>The prototype is feature-complete for this sprint: the full loop — checklist → photo or PIN proof → parent review/confirmation → minute banking → unlock → streak — works end to end with no known incomplete flows, and has been manually tested through each path (photo submission, PIN confirmation, parent approve/reject, emergency unlock, goal add/remove, and the screen-time countdown). This is the final version submitted for Week 5.</w:t>
       </w:r>
     </w:p>
     <w:p>

</xml_diff>